<commit_message>
Replace the multiplication form with prose in the decision rule
The rule is a set of considerations, not a calculation; the multiplication
sign implied a precision it never had. Now reads: progression is shaped by
risk, complexity, learner competence and the required operational outcome.
Applied to the approach document, the working synthesis, the poster and the
directive's Annex A, with the glosses above it de-duplicated.

Co-Authored-By: Claude Opus 5 <noreply@anthropic.com>
Claude-Session: https://claude.ai/code/session_014ebTbQdLKZmAdeXWfR1Dsj
</commit_message>
<xml_diff>
--- a/output/individual-training-approach.docx
+++ b/output/individual-training-approach.docx
@@ -480,7 +480,7 @@
           <w:b w:val="false"/>
           <w:i w:val="false"/>
         </w:rPr>
-        <w:t>How far and how fast an individual progresses. It is applied to every course. Schools applying it to different courses reach different answers; those answers are coherent because the reasoning is common.</w:t>
+        <w:t>Applied to every course. Schools applying it to different courses reach different answers; those answers are coherent because the reasoning is common.</w:t>
       </w:r>
     </w:p>
     <w:p>
@@ -499,7 +499,7 @@
           <w:color w:val="FFFFFF"/>
           <w:sz w:val="18"/>
         </w:rPr>
-        <w:t>Risk × Complexity × Learner Competence × Required Operational Outcome</w:t>
+        <w:t>Progression is shaped by risk, complexity, learner competence and the required operational outcome</w:t>
       </w:r>
     </w:p>
     <w:p>

</xml_diff>